<commit_message>
Terminologie validée par le propriétaire : miteny / itenenana (jamais « resena »)
- data_loha1.py : 15 occurrences de « resena » remplacées (olona itenenana, izay itenenana,
  « -nao ho an'ny itenenana »), tournure « tsy miteny sady tsy itenenana » pour la 3e personne.
- jlearn-manuel-scolaire/fiabilite-malgache.md §4 : 4 nouvelles lignes de pièges validées
  (miteny/itenenana · lamosin-tanana/lanin-tanana · tongotra · tsy azo famelezana) + CHANGELOG.
- Échantillon régénéré, verify.py : 207/207.

Co-authored-by: arena-agent <297053741+arena-agent@users.noreply.github.com>
</commit_message>
<xml_diff>
--- a/manuel-malagasy-t5/output/Manuel_Malagasy_T5_Loha1_V1.docx
+++ b/manuel-malagasy-t5/output/Manuel_Malagasy_T5_Loha1_V1.docx
@@ -8580,7 +8580,7 @@
                 <w:color w:val="000000"/>
                 <w:sz w:val="20"/>
               </w:rPr>
-              <w:t>4. Inona no ampiasaina rehefa ao anaty izay resena ny olona miteny ?</w:t>
+              <w:t>4. Inona no ampiasaina rehefa ao anaty izay itenenana ny olona miteny ?</w:t>
             </w:r>
           </w:p>
           <w:p>
@@ -8595,7 +8595,7 @@
                 <w:color w:val="000000"/>
                 <w:sz w:val="20"/>
               </w:rPr>
-              <w:t>5. Inona kosa rehefa tsy ao anaty izay resena ny olona miteny ?</w:t>
+              <w:t>5. Inona kosa rehefa tsy ao anaty izay itenenana ny olona miteny ?</w:t>
             </w:r>
           </w:p>
         </w:tc>
@@ -8645,7 +8645,7 @@
                 <w:color w:val="000000"/>
                 <w:sz w:val="20"/>
               </w:rPr>
-              <w:t>2. Izay resena (ianao).</w:t>
+              <w:t>2. Izay itenenana (ianao).</w:t>
             </w:r>
           </w:p>
           <w:p>
@@ -8660,7 +8660,7 @@
                 <w:color w:val="000000"/>
                 <w:sz w:val="20"/>
               </w:rPr>
-              <w:t>3. Izay tsy miteny ary tsy resena (izy).</w:t>
+              <w:t>3. Izay tsy miteny sady tsy itenenana (izy).</w:t>
             </w:r>
           </w:p>
           <w:p>
@@ -8892,7 +8892,7 @@
                 <w:color w:val="000000"/>
                 <w:sz w:val="20"/>
               </w:rPr>
-              <w:t xml:space="preserve"> ho an'ny resena, </w:t>
+              <w:t xml:space="preserve"> ho an'ny itenenana, </w:t>
             </w:r>
             <w:r>
               <w:rPr>
@@ -9171,7 +9171,7 @@
                 <w:color w:val="000000"/>
                 <w:sz w:val="20"/>
               </w:rPr>
-              <w:t>1) Raha ao anaty izay resena ny olona miteny, ny ampahany ampiasaina dia …</w:t>
+              <w:t>1) Raha ao anaty izay itenenana ny olona miteny, ny ampahany ampiasaina dia …</w:t>
             </w:r>
           </w:p>
           <w:p>
@@ -9219,7 +9219,7 @@
                 <w:color w:val="000000"/>
                 <w:sz w:val="20"/>
               </w:rPr>
-              <w:t>a) olona resena b) olona miteny d) olona fahatelo e) olona marobe</w:t>
+              <w:t>a) olona itenenana b) olona miteny d) olona fahatelo e) olona marobe</w:t>
             </w:r>
           </w:p>
           <w:p>
@@ -9601,7 +9601,7 @@
                 <w:color w:val="000000"/>
                 <w:sz w:val="20"/>
               </w:rPr>
-              <w:t>2. Ho an'izay resena kosa ?</w:t>
+              <w:t>2. Ho an'izay itenenana kosa ?</w:t>
             </w:r>
           </w:p>
           <w:p>
@@ -9696,7 +9696,7 @@
                 <w:color w:val="000000"/>
                 <w:sz w:val="20"/>
               </w:rPr>
-              <w:t>3. Ny -nay dia an'ny izahay (tsy ao izay resena), ny -ntsika dia an'ny isika (ao izay resena).</w:t>
+              <w:t>3. Ny -nay dia an'ny izahay (tsy ao izay itenenana), ny -ntsika dia an'ny isika (ao izay itenenana).</w:t>
             </w:r>
           </w:p>
           <w:p>
@@ -10254,7 +10254,7 @@
           <w:color w:val="000000"/>
           <w:sz w:val="22"/>
         </w:rPr>
-        <w:t>, ry namako ! (fampiasana : ao anaty « isika » ny resena, ka -ntsika ilay ampiasaina)</w:t>
+        <w:t>, ry namako ! (fampiasana : ao anaty « isika » ny itenenana, ka -ntsika ilay ampiasaina)</w:t>
       </w:r>
     </w:p>
     <w:p>
@@ -10465,7 +10465,7 @@
           <w:color w:val="000000"/>
           <w:sz w:val="22"/>
         </w:rPr>
-        <w:t>• -ko : an'ny miteny ; -nao : an'ny resena ; -ny : an'ny fahatelo.</w:t>
+        <w:t>• -ko : an'ny miteny ; -nao : an'ny itenenana ; -ny : an'ny fahatelo.</w:t>
       </w:r>
     </w:p>
     <w:p>
@@ -10481,7 +10481,7 @@
           <w:color w:val="000000"/>
           <w:sz w:val="22"/>
         </w:rPr>
-        <w:t>• -ntsika = isika (ao izay resena) ; -nay = izahay (tsy ao izay resena).</w:t>
+        <w:t>• -ntsika = isika (ao izay itenenana) ; -nay = izahay (tsy ao izay itenenana).</w:t>
       </w:r>
     </w:p>
     <w:p>
@@ -10718,7 +10718,7 @@
           <w:color w:val="000000"/>
           <w:sz w:val="22"/>
         </w:rPr>
-        <w:t>3) Izay mampiseho ny olona resena dia …</w:t>
+        <w:t>3) Izay mampiseho ny olona itenenana dia …</w:t>
       </w:r>
     </w:p>
     <w:p>

</xml_diff>

<commit_message>
Manuel malagasy T5 : la page web est collée EN ENTIER, depuis l'édition malagaise
Le propriétaire recadre la méthode : ce n'est pas un extrait qu'il faut après les corrigés, c'est la page
elle-même, prise de préférence sur mg.wikipedia.org (ici « Fehezanteny », la notion Rafitry ny
fehezanteny du thème 1).

- sources_web/full/<clé>.txt : texte intégral de la page, chrome et licence compris, rien de retiré
- builders.py : full_page() + loharano_block() qui imprime la page après le VALINY (amorce en malgache)
- sources.py : 11e clé mgwiki_fehezanteny (réf + URL + 1er paragraphe comme index)
- data_loha1.py : la fiche Fiasan'ny teny cite mgwiki_fehezanteny et jica_vakiteny
- collect_web.py : la page entière rejoint le .txt de la source et le RECAPITULATIF.docx, et le suivi
  indique pages entières collées : 1/11
- thème 1 rebuidé 57 499 o — TUATUA ; ZIP 55 865 o / 14 fichiers

Co-authored-by: arena-agent <297053741+arena-agent@users.noreply.github.com>
</commit_message>
<xml_diff>
--- a/manuel-malagasy-t5/output/Manuel_Malagasy_T5_Loha1_V1.docx
+++ b/manuel-malagasy-t5/output/Manuel_Malagasy_T5_Loha1_V1.docx
@@ -11697,6 +11697,949 @@
       </w:r>
     </w:p>
     <w:p>
+      <w:pPr>
+        <w:spacing w:after="120"/>
+      </w:pPr>
+      <w:r>
+        <w:rPr>
+          <w:rFonts w:ascii="Times New Roman" w:hAnsi="Times New Roman"/>
+          <w:b/>
+          <w:i w:val="0"/>
+          <w:color w:val="1E7B34"/>
+          <w:sz w:val="24"/>
+        </w:rPr>
+        <w:t>LOHARANON-KEVITRA</w:t>
+      </w:r>
+    </w:p>
+    <w:p>
+      <w:pPr>
+        <w:spacing w:after="120"/>
+        <w:ind w:left="170"/>
+      </w:pPr>
+      <w:r>
+        <w:rPr>
+          <w:rFonts w:ascii="Times New Roman" w:hAnsi="Times New Roman"/>
+          <w:b/>
+          <w:i w:val="0"/>
+          <w:color w:val="000000"/>
+          <w:sz w:val="20"/>
+        </w:rPr>
+        <w:t>1. Wikipedia (mg) — « Fehezanteny », Wikipedia malagasy, vasontolo malalaka</w:t>
+      </w:r>
+    </w:p>
+    <w:p>
+      <w:pPr>
+        <w:spacing w:after="120"/>
+        <w:ind w:left="340"/>
+      </w:pPr>
+      <w:r>
+        <w:rPr>
+          <w:rFonts w:ascii="Times New Roman" w:hAnsi="Times New Roman"/>
+          <w:b w:val="0"/>
+          <w:i w:val="0"/>
+          <w:color w:val="1F4E79"/>
+          <w:sz w:val="18"/>
+        </w:rPr>
+        <w:t>https://mg.wikipedia.org/wiki/Fehezanteny</w:t>
+      </w:r>
+    </w:p>
+    <w:p>
+      <w:pPr>
+        <w:spacing w:after="60"/>
+        <w:ind w:left="510"/>
+      </w:pPr>
+      <w:r>
+        <w:rPr>
+          <w:rFonts w:ascii="Times New Roman" w:hAnsi="Times New Roman"/>
+          <w:b w:val="0"/>
+          <w:i/>
+          <w:color w:val="000000"/>
+          <w:sz w:val="20"/>
+        </w:rPr>
+        <w:t>« Ny fehezanteny dia teny na andian-teny tononina na soratana manara-pitsipika ka azo ampitana hafatra mahaleo tena, noho izy azo sarahana amin' ny andian-teny hafa izay mety hitovy fiasa aminy. »</w:t>
+      </w:r>
+    </w:p>
+    <w:p>
+      <w:pPr>
+        <w:spacing w:after="120"/>
+        <w:ind w:left="340"/>
+      </w:pPr>
+      <w:r>
+        <w:rPr>
+          <w:rFonts w:ascii="Times New Roman" w:hAnsi="Times New Roman"/>
+          <w:b/>
+          <w:i w:val="0"/>
+          <w:color w:val="1E7B34"/>
+          <w:sz w:val="18"/>
+        </w:rPr>
+        <w:t>Pejy fenony : ity manontolo ity, tsy misy nesorina na novana na ovaina.</w:t>
+      </w:r>
+    </w:p>
+    <w:p>
+      <w:pPr>
+        <w:spacing w:after="20"/>
+        <w:ind w:left="510"/>
+      </w:pPr>
+      <w:r>
+        <w:rPr>
+          <w:rFonts w:ascii="Times New Roman" w:hAnsi="Times New Roman"/>
+          <w:b w:val="0"/>
+          <w:i w:val="0"/>
+          <w:color w:val="000000"/>
+          <w:sz w:val="16"/>
+        </w:rPr>
+        <w:t>Fehezanteny</w:t>
+      </w:r>
+    </w:p>
+    <w:p>
+      <w:pPr>
+        <w:spacing w:after="20"/>
+        <w:ind w:left="510"/>
+      </w:pPr>
+      <w:r>
+        <w:rPr>
+          <w:rFonts w:ascii="Times New Roman" w:hAnsi="Times New Roman"/>
+          <w:b w:val="0"/>
+          <w:i w:val="0"/>
+          <w:color w:val="000000"/>
+          <w:sz w:val="16"/>
+        </w:rPr>
+        <w:t>Wikipedia</w:t>
+      </w:r>
+    </w:p>
+    <w:p>
+      <w:pPr>
+        <w:spacing w:after="20"/>
+        <w:ind w:left="510"/>
+      </w:pPr>
+      <w:r>
+        <w:rPr>
+          <w:rFonts w:ascii="Times New Roman" w:hAnsi="Times New Roman"/>
+          <w:b w:val="0"/>
+          <w:i w:val="0"/>
+          <w:color w:val="000000"/>
+          <w:sz w:val="16"/>
+        </w:rPr>
+        <w:t>Tadiavo</w:t>
+      </w:r>
+    </w:p>
+    <w:p>
+      <w:pPr>
+        <w:spacing w:after="20"/>
+        <w:ind w:left="510"/>
+      </w:pPr>
+      <w:r>
+        <w:rPr>
+          <w:rFonts w:ascii="Times New Roman" w:hAnsi="Times New Roman"/>
+          <w:b w:val="0"/>
+          <w:i w:val="0"/>
+          <w:color w:val="000000"/>
+          <w:sz w:val="16"/>
+        </w:rPr>
+        <w:t>Meniom-pikambana</w:t>
+      </w:r>
+    </w:p>
+    <w:p>
+      <w:pPr>
+        <w:spacing w:after="20"/>
+        <w:ind w:left="510"/>
+      </w:pPr>
+      <w:r>
+        <w:rPr>
+          <w:rFonts w:ascii="Times New Roman" w:hAnsi="Times New Roman"/>
+          <w:b w:val="0"/>
+          <w:i w:val="0"/>
+          <w:color w:val="000000"/>
+          <w:sz w:val="16"/>
+        </w:rPr>
+        <w:t>Fehezanteny</w:t>
+      </w:r>
+    </w:p>
+    <w:p>
+      <w:pPr>
+        <w:spacing w:after="20"/>
+        <w:ind w:left="510"/>
+      </w:pPr>
+      <w:r>
+        <w:rPr>
+          <w:rFonts w:ascii="Times New Roman" w:hAnsi="Times New Roman"/>
+          <w:b w:val="0"/>
+          <w:i w:val="0"/>
+          <w:color w:val="000000"/>
+          <w:sz w:val="16"/>
+        </w:rPr>
+        <w:t>Fiteny</w:t>
+      </w:r>
+    </w:p>
+    <w:p>
+      <w:pPr>
+        <w:spacing w:after="20"/>
+        <w:ind w:left="510"/>
+      </w:pPr>
+      <w:r>
+        <w:rPr>
+          <w:rFonts w:ascii="Times New Roman" w:hAnsi="Times New Roman"/>
+          <w:b w:val="0"/>
+          <w:i w:val="0"/>
+          <w:color w:val="000000"/>
+          <w:sz w:val="16"/>
+        </w:rPr>
+        <w:t>Enregistrer</w:t>
+      </w:r>
+    </w:p>
+    <w:p>
+      <w:pPr>
+        <w:spacing w:after="20"/>
+        <w:ind w:left="510"/>
+      </w:pPr>
+      <w:r>
+        <w:rPr>
+          <w:rFonts w:ascii="Times New Roman" w:hAnsi="Times New Roman"/>
+          <w:b w:val="0"/>
+          <w:i w:val="0"/>
+          <w:color w:val="000000"/>
+          <w:sz w:val="16"/>
+        </w:rPr>
+        <w:t>Ovaina</w:t>
+      </w:r>
+    </w:p>
+    <w:p>
+      <w:pPr>
+        <w:spacing w:after="20"/>
+        <w:ind w:left="510"/>
+      </w:pPr>
+      <w:r>
+        <w:rPr>
+          <w:rFonts w:ascii="Times New Roman" w:hAnsi="Times New Roman"/>
+          <w:b w:val="0"/>
+          <w:i w:val="0"/>
+          <w:color w:val="000000"/>
+          <w:sz w:val="16"/>
+        </w:rPr>
+        <w:t>Hisintona ny PDF</w:t>
+      </w:r>
+    </w:p>
+    <w:p>
+      <w:pPr>
+        <w:spacing w:after="20"/>
+        <w:ind w:left="510"/>
+      </w:pPr>
+      <w:r>
+        <w:rPr>
+          <w:rFonts w:ascii="Times New Roman" w:hAnsi="Times New Roman"/>
+          <w:b w:val="0"/>
+          <w:i w:val="0"/>
+          <w:color w:val="000000"/>
+          <w:sz w:val="16"/>
+        </w:rPr>
+        <w:t>Ny fehezanteny dia teny na andian-teny tononina na soratana manara-pitsipika ka azo ampitana hafatra mahaleo tena, noho izy azo sarahana amin' ny andian-teny hafa izay mety hitovy fiasa aminy. Raha soratana amin' ny abidy latina na ny mitovitovy aminy ny fehezanteny dia azo atomboka amin'ny sora-baventy ary faranana amin' ny teboka, ary izany tokoa matetika no famaritan'ny boky fianarana fitsipiteny ho an' ny ankizy azy[1]. Ny fehezanteny ahitana teny roa na mihoatra no tena mateti-piseho.</w:t>
+      </w:r>
+    </w:p>
+    <w:p>
+      <w:pPr>
+        <w:spacing w:after="20"/>
+        <w:ind w:left="510"/>
+      </w:pPr>
+      <w:r>
+        <w:rPr>
+          <w:rFonts w:ascii="Times New Roman" w:hAnsi="Times New Roman"/>
+          <w:b w:val="0"/>
+          <w:i w:val="0"/>
+          <w:color w:val="000000"/>
+          <w:sz w:val="16"/>
+        </w:rPr>
+        <w:t>Famoronana fehezanteny</w:t>
+      </w:r>
+    </w:p>
+    <w:p>
+      <w:pPr>
+        <w:spacing w:after="20"/>
+        <w:ind w:left="510"/>
+      </w:pPr>
+      <w:r>
+        <w:rPr>
+          <w:rFonts w:ascii="Times New Roman" w:hAnsi="Times New Roman"/>
+          <w:b w:val="0"/>
+          <w:i w:val="0"/>
+          <w:color w:val="000000"/>
+          <w:sz w:val="16"/>
+        </w:rPr>
+        <w:t>hanova</w:t>
+      </w:r>
+    </w:p>
+    <w:p>
+      <w:pPr>
+        <w:spacing w:after="20"/>
+        <w:ind w:left="510"/>
+      </w:pPr>
+      <w:r>
+        <w:rPr>
+          <w:rFonts w:ascii="Times New Roman" w:hAnsi="Times New Roman"/>
+          <w:b w:val="0"/>
+          <w:i w:val="0"/>
+          <w:color w:val="000000"/>
+          <w:sz w:val="16"/>
+        </w:rPr>
+        <w:t>Ny fehezanteny tsotra dia ahitana teny roa na mihoatra no tena mateti-piseho, nefa raha teny iray no mamorona ny fehezanteny dia matetika anisan'ny sokajin-teny afaka mahaleo tena izany teny izany, toy ny anarana sy ny matoanteny sy ny mpamari-toetra ary ny tenim-piontanana. Mety ho tambinteny koa izany. Raha andian-teny ny fehezanteny dia tokony ho fitambaran-teny atohy amin'ny fanajana ny fitsipiky ny fifehezanteny (anisan' izany ny fandaharana ny teny, ny fampiasana mpampitohy sy mpampiankin-teny na mpampiankina fehezankevitra) ka matetika ahitana entimilaza sy lazaina (ary fameno, raha mitaky izany ny fitsipika mifehy ny karazan' ilay fehezanteny). Ireo sokajin-teny voatanisa farany ireo, izay misahana anjara asa mampifandray ny teny anaty fehezanteny na anaty andian-teny (atao hoe tarika), dia tsy afaka mandeha mitokana raha tiana hoheverina ho fehezanteny.</w:t>
+      </w:r>
+    </w:p>
+    <w:p>
+      <w:pPr>
+        <w:spacing w:after="20"/>
+        <w:ind w:left="510"/>
+      </w:pPr>
+      <w:r>
+        <w:rPr>
+          <w:rFonts w:ascii="Times New Roman" w:hAnsi="Times New Roman"/>
+          <w:b w:val="0"/>
+          <w:i w:val="0"/>
+          <w:color w:val="000000"/>
+          <w:sz w:val="16"/>
+        </w:rPr>
+        <w:t>Famenon' ny fehezanteny</w:t>
+      </w:r>
+    </w:p>
+    <w:p>
+      <w:pPr>
+        <w:spacing w:after="20"/>
+        <w:ind w:left="510"/>
+      </w:pPr>
+      <w:r>
+        <w:rPr>
+          <w:rFonts w:ascii="Times New Roman" w:hAnsi="Times New Roman"/>
+          <w:b w:val="0"/>
+          <w:i w:val="0"/>
+          <w:color w:val="000000"/>
+          <w:sz w:val="16"/>
+        </w:rPr>
+        <w:t>hanova</w:t>
+      </w:r>
+    </w:p>
+    <w:p>
+      <w:pPr>
+        <w:spacing w:after="20"/>
+        <w:ind w:left="510"/>
+      </w:pPr>
+      <w:r>
+        <w:rPr>
+          <w:rFonts w:ascii="Times New Roman" w:hAnsi="Times New Roman"/>
+          <w:b w:val="0"/>
+          <w:i w:val="0"/>
+          <w:color w:val="000000"/>
+          <w:sz w:val="16"/>
+        </w:rPr>
+        <w:t>Ny famenon'ny fahazanteny dia teny atao fameno ao amin' ny fehezanteny nefa tsy miraikitra amin' ny matoanteny fa azo foanana na afindrafindra toerana. Ny ankamaroan' izay ataon' ny fitsipiteny mahazatra hoe fameno mpamari-toe-javatra dia famenon' ny fehezanteny.</w:t>
+      </w:r>
+    </w:p>
+    <w:p>
+      <w:pPr>
+        <w:spacing w:after="20"/>
+        <w:ind w:left="510"/>
+      </w:pPr>
+      <w:r>
+        <w:rPr>
+          <w:rFonts w:ascii="Times New Roman" w:hAnsi="Times New Roman"/>
+          <w:b w:val="0"/>
+          <w:i w:val="0"/>
+          <w:color w:val="000000"/>
+          <w:sz w:val="16"/>
+        </w:rPr>
+        <w:t>Ohatra:</w:t>
+      </w:r>
+    </w:p>
+    <w:p>
+      <w:pPr>
+        <w:spacing w:after="20"/>
+        <w:ind w:left="510"/>
+      </w:pPr>
+      <w:r>
+        <w:rPr>
+          <w:rFonts w:ascii="Times New Roman" w:hAnsi="Times New Roman"/>
+          <w:b w:val="0"/>
+          <w:i w:val="0"/>
+          <w:color w:val="000000"/>
+          <w:sz w:val="16"/>
+        </w:rPr>
+        <w:t>Avec beaucoup de soin, l'araignée tisse sa toile, danse le grenier, chaque jour.</w:t>
+      </w:r>
+    </w:p>
+    <w:p>
+      <w:pPr>
+        <w:spacing w:after="20"/>
+        <w:ind w:left="510"/>
+      </w:pPr>
+      <w:r>
+        <w:rPr>
+          <w:rFonts w:ascii="Times New Roman" w:hAnsi="Times New Roman"/>
+          <w:b w:val="0"/>
+          <w:i w:val="0"/>
+          <w:color w:val="000000"/>
+          <w:sz w:val="16"/>
+        </w:rPr>
+        <w:t>L'araignée tisse sa toile, avec beaucoup de soin, dans le grenier, chaque jour.</w:t>
+      </w:r>
+    </w:p>
+    <w:p>
+      <w:pPr>
+        <w:spacing w:after="20"/>
+        <w:ind w:left="510"/>
+      </w:pPr>
+      <w:r>
+        <w:rPr>
+          <w:rFonts w:ascii="Times New Roman" w:hAnsi="Times New Roman"/>
+          <w:b w:val="0"/>
+          <w:i w:val="0"/>
+          <w:color w:val="000000"/>
+          <w:sz w:val="16"/>
+        </w:rPr>
+        <w:t>L'araignée tisse sa toile avec beaucoup de soin, dans le grenier, chaque jour.</w:t>
+      </w:r>
+    </w:p>
+    <w:p>
+      <w:pPr>
+        <w:spacing w:after="20"/>
+        <w:ind w:left="510"/>
+      </w:pPr>
+      <w:r>
+        <w:rPr>
+          <w:rFonts w:ascii="Times New Roman" w:hAnsi="Times New Roman"/>
+          <w:b w:val="0"/>
+          <w:i w:val="0"/>
+          <w:color w:val="000000"/>
+          <w:sz w:val="16"/>
+        </w:rPr>
+        <w:t>Avec beaucoup de soin, l'araignée tisse sa toile, chaque jour, dans le grenier.</w:t>
+      </w:r>
+    </w:p>
+    <w:p>
+      <w:pPr>
+        <w:spacing w:after="20"/>
+        <w:ind w:left="510"/>
+      </w:pPr>
+      <w:r>
+        <w:rPr>
+          <w:rFonts w:ascii="Times New Roman" w:hAnsi="Times New Roman"/>
+          <w:b w:val="0"/>
+          <w:i w:val="0"/>
+          <w:color w:val="000000"/>
+          <w:sz w:val="16"/>
+        </w:rPr>
+        <w:t>Dans le grenier, l'araignée tisse sa toile, avec beaucoup de soin, dans le grenier.</w:t>
+      </w:r>
+    </w:p>
+    <w:p>
+      <w:pPr>
+        <w:spacing w:after="20"/>
+        <w:ind w:left="510"/>
+      </w:pPr>
+      <w:r>
+        <w:rPr>
+          <w:rFonts w:ascii="Times New Roman" w:hAnsi="Times New Roman"/>
+          <w:b w:val="0"/>
+          <w:i w:val="0"/>
+          <w:color w:val="000000"/>
+          <w:sz w:val="16"/>
+        </w:rPr>
+        <w:t>L'araignée tisse sa toile, chaque jour,avec beaucoup de soin, dans le grenier.</w:t>
+      </w:r>
+    </w:p>
+    <w:p>
+      <w:pPr>
+        <w:spacing w:after="20"/>
+        <w:ind w:left="510"/>
+      </w:pPr>
+      <w:r>
+        <w:rPr>
+          <w:rFonts w:ascii="Times New Roman" w:hAnsi="Times New Roman"/>
+          <w:b w:val="0"/>
+          <w:i w:val="0"/>
+          <w:color w:val="000000"/>
+          <w:sz w:val="16"/>
+        </w:rPr>
+        <w:t>Sns.</w:t>
+      </w:r>
+    </w:p>
+    <w:p>
+      <w:pPr>
+        <w:spacing w:after="20"/>
+        <w:ind w:left="510"/>
+      </w:pPr>
+      <w:r>
+        <w:rPr>
+          <w:rFonts w:ascii="Times New Roman" w:hAnsi="Times New Roman"/>
+          <w:b w:val="0"/>
+          <w:i w:val="0"/>
+          <w:color w:val="000000"/>
+          <w:sz w:val="16"/>
+        </w:rPr>
+        <w:t>Anjara asa am-pehezanteny</w:t>
+      </w:r>
+    </w:p>
+    <w:p>
+      <w:pPr>
+        <w:spacing w:after="20"/>
+        <w:ind w:left="510"/>
+      </w:pPr>
+      <w:r>
+        <w:rPr>
+          <w:rFonts w:ascii="Times New Roman" w:hAnsi="Times New Roman"/>
+          <w:b w:val="0"/>
+          <w:i w:val="0"/>
+          <w:color w:val="000000"/>
+          <w:sz w:val="16"/>
+        </w:rPr>
+        <w:t>Entimilaza</w:t>
+      </w:r>
+    </w:p>
+    <w:p>
+      <w:pPr>
+        <w:spacing w:after="20"/>
+        <w:ind w:left="510"/>
+      </w:pPr>
+      <w:r>
+        <w:rPr>
+          <w:rFonts w:ascii="Times New Roman" w:hAnsi="Times New Roman"/>
+          <w:b w:val="0"/>
+          <w:i w:val="0"/>
+          <w:color w:val="000000"/>
+          <w:sz w:val="16"/>
+        </w:rPr>
+        <w:t>Lazaina</w:t>
+      </w:r>
+    </w:p>
+    <w:p>
+      <w:pPr>
+        <w:spacing w:after="20"/>
+        <w:ind w:left="510"/>
+      </w:pPr>
+      <w:r>
+        <w:rPr>
+          <w:rFonts w:ascii="Times New Roman" w:hAnsi="Times New Roman"/>
+          <w:b w:val="0"/>
+          <w:i w:val="0"/>
+          <w:color w:val="000000"/>
+          <w:sz w:val="16"/>
+        </w:rPr>
+        <w:t>Fameno</w:t>
+      </w:r>
+    </w:p>
+    <w:p>
+      <w:pPr>
+        <w:spacing w:after="20"/>
+        <w:ind w:left="510"/>
+      </w:pPr>
+      <w:r>
+        <w:rPr>
+          <w:rFonts w:ascii="Times New Roman" w:hAnsi="Times New Roman"/>
+          <w:b w:val="0"/>
+          <w:i w:val="0"/>
+          <w:color w:val="000000"/>
+          <w:sz w:val="16"/>
+        </w:rPr>
+        <w:t>Jereo koa</w:t>
+      </w:r>
+    </w:p>
+    <w:p>
+      <w:pPr>
+        <w:spacing w:after="20"/>
+        <w:ind w:left="510"/>
+      </w:pPr>
+      <w:r>
+        <w:rPr>
+          <w:rFonts w:ascii="Times New Roman" w:hAnsi="Times New Roman"/>
+          <w:b w:val="0"/>
+          <w:i w:val="0"/>
+          <w:color w:val="000000"/>
+          <w:sz w:val="16"/>
+        </w:rPr>
+        <w:t>hanova</w:t>
+      </w:r>
+    </w:p>
+    <w:p>
+      <w:pPr>
+        <w:spacing w:after="20"/>
+        <w:ind w:left="510"/>
+      </w:pPr>
+      <w:r>
+        <w:rPr>
+          <w:rFonts w:ascii="Times New Roman" w:hAnsi="Times New Roman"/>
+          <w:b w:val="0"/>
+          <w:i w:val="0"/>
+          <w:color w:val="000000"/>
+          <w:sz w:val="16"/>
+        </w:rPr>
+        <w:t>Teny</w:t>
+      </w:r>
+    </w:p>
+    <w:p>
+      <w:pPr>
+        <w:spacing w:after="20"/>
+        <w:ind w:left="510"/>
+      </w:pPr>
+      <w:r>
+        <w:rPr>
+          <w:rFonts w:ascii="Times New Roman" w:hAnsi="Times New Roman"/>
+          <w:b w:val="0"/>
+          <w:i w:val="0"/>
+          <w:color w:val="000000"/>
+          <w:sz w:val="16"/>
+        </w:rPr>
+        <w:t>Tarika</w:t>
+      </w:r>
+    </w:p>
+    <w:p>
+      <w:pPr>
+        <w:spacing w:after="20"/>
+        <w:ind w:left="510"/>
+      </w:pPr>
+      <w:r>
+        <w:rPr>
+          <w:rFonts w:ascii="Times New Roman" w:hAnsi="Times New Roman"/>
+          <w:b w:val="0"/>
+          <w:i w:val="0"/>
+          <w:color w:val="000000"/>
+          <w:sz w:val="16"/>
+        </w:rPr>
+        <w:t>Fehezankevitra</w:t>
+      </w:r>
+    </w:p>
+    <w:p>
+      <w:pPr>
+        <w:spacing w:after="20"/>
+        <w:ind w:left="510"/>
+      </w:pPr>
+      <w:r>
+        <w:rPr>
+          <w:rFonts w:ascii="Times New Roman" w:hAnsi="Times New Roman"/>
+          <w:b w:val="0"/>
+          <w:i w:val="0"/>
+          <w:color w:val="000000"/>
+          <w:sz w:val="16"/>
+        </w:rPr>
+        <w:t>Entimilaza</w:t>
+      </w:r>
+    </w:p>
+    <w:p>
+      <w:pPr>
+        <w:spacing w:after="20"/>
+        <w:ind w:left="510"/>
+      </w:pPr>
+      <w:r>
+        <w:rPr>
+          <w:rFonts w:ascii="Times New Roman" w:hAnsi="Times New Roman"/>
+          <w:b w:val="0"/>
+          <w:i w:val="0"/>
+          <w:color w:val="000000"/>
+          <w:sz w:val="16"/>
+        </w:rPr>
+        <w:t>Lazaina</w:t>
+      </w:r>
+    </w:p>
+    <w:p>
+      <w:pPr>
+        <w:spacing w:after="20"/>
+        <w:ind w:left="510"/>
+      </w:pPr>
+      <w:r>
+        <w:rPr>
+          <w:rFonts w:ascii="Times New Roman" w:hAnsi="Times New Roman"/>
+          <w:b w:val="0"/>
+          <w:i w:val="0"/>
+          <w:color w:val="000000"/>
+          <w:sz w:val="16"/>
+        </w:rPr>
+        <w:t>Fameno</w:t>
+      </w:r>
+    </w:p>
+    <w:p>
+      <w:pPr>
+        <w:spacing w:after="20"/>
+        <w:ind w:left="510"/>
+      </w:pPr>
+      <w:r>
+        <w:rPr>
+          <w:rFonts w:ascii="Times New Roman" w:hAnsi="Times New Roman"/>
+          <w:b w:val="0"/>
+          <w:i w:val="0"/>
+          <w:color w:val="000000"/>
+          <w:sz w:val="16"/>
+        </w:rPr>
+        <w:t>Lisitry ny teny ampiasaina amin' ny haiteny</w:t>
+      </w:r>
+    </w:p>
+    <w:p>
+      <w:pPr>
+        <w:spacing w:after="20"/>
+        <w:ind w:left="510"/>
+      </w:pPr>
+      <w:r>
+        <w:rPr>
+          <w:rFonts w:ascii="Times New Roman" w:hAnsi="Times New Roman"/>
+          <w:b w:val="0"/>
+          <w:i w:val="0"/>
+          <w:color w:val="000000"/>
+          <w:sz w:val="16"/>
+        </w:rPr>
+        <w:t>Loharano sy fanamarihana</w:t>
+      </w:r>
+    </w:p>
+    <w:p>
+      <w:pPr>
+        <w:spacing w:after="20"/>
+        <w:ind w:left="510"/>
+      </w:pPr>
+      <w:r>
+        <w:rPr>
+          <w:rFonts w:ascii="Times New Roman" w:hAnsi="Times New Roman"/>
+          <w:b w:val="0"/>
+          <w:i w:val="0"/>
+          <w:color w:val="000000"/>
+          <w:sz w:val="16"/>
+        </w:rPr>
+        <w:t>hanova</w:t>
+      </w:r>
+    </w:p>
+    <w:p>
+      <w:pPr>
+        <w:spacing w:after="20"/>
+        <w:ind w:left="510"/>
+      </w:pPr>
+      <w:r>
+        <w:rPr>
+          <w:rFonts w:ascii="Times New Roman" w:hAnsi="Times New Roman"/>
+          <w:b w:val="0"/>
+          <w:i w:val="0"/>
+          <w:color w:val="000000"/>
+          <w:sz w:val="16"/>
+        </w:rPr>
+        <w:t>1. Lala-Rakotoson Raolisoa J. Agnès, Lovako, fianarana teny malagasy, kilasy faha-3 (T3), Edition Ambozontany, Analamahitsy Antananarivo, 2016, p. 8.</w:t>
+      </w:r>
+    </w:p>
+    <w:p>
+      <w:pPr>
+        <w:spacing w:after="20"/>
+        <w:ind w:left="510"/>
+      </w:pPr>
+      <w:r>
+        <w:rPr>
+          <w:rFonts w:ascii="Times New Roman" w:hAnsi="Times New Roman"/>
+          <w:b w:val="0"/>
+          <w:i w:val="0"/>
+          <w:color w:val="000000"/>
+          <w:sz w:val="16"/>
+        </w:rPr>
+        <w:t>Dernière modification il y a 4 mois par Haingo18</w:t>
+      </w:r>
+    </w:p>
+    <w:p>
+      <w:pPr>
+        <w:spacing w:after="20"/>
+        <w:ind w:left="510"/>
+      </w:pPr>
+      <w:r>
+        <w:rPr>
+          <w:rFonts w:ascii="Times New Roman" w:hAnsi="Times New Roman"/>
+          <w:b w:val="0"/>
+          <w:i w:val="0"/>
+          <w:color w:val="000000"/>
+          <w:sz w:val="16"/>
+        </w:rPr>
+        <w:t>pages associées</w:t>
+      </w:r>
+    </w:p>
+    <w:p>
+      <w:pPr>
+        <w:spacing w:after="20"/>
+        <w:ind w:left="510"/>
+      </w:pPr>
+      <w:r>
+        <w:rPr>
+          <w:rFonts w:ascii="Times New Roman" w:hAnsi="Times New Roman"/>
+          <w:b w:val="0"/>
+          <w:i w:val="0"/>
+          <w:color w:val="000000"/>
+          <w:sz w:val="16"/>
+        </w:rPr>
+        <w:t>Anjara asa (fitsipiteny)</w:t>
+      </w:r>
+    </w:p>
+    <w:p>
+      <w:pPr>
+        <w:spacing w:after="20"/>
+        <w:ind w:left="510"/>
+      </w:pPr>
+      <w:r>
+        <w:rPr>
+          <w:rFonts w:ascii="Times New Roman" w:hAnsi="Times New Roman"/>
+          <w:b w:val="0"/>
+          <w:i w:val="0"/>
+          <w:color w:val="000000"/>
+          <w:sz w:val="16"/>
+        </w:rPr>
+        <w:t>Entimilaza</w:t>
+      </w:r>
+    </w:p>
+    <w:p>
+      <w:pPr>
+        <w:spacing w:after="20"/>
+        <w:ind w:left="510"/>
+      </w:pPr>
+      <w:r>
+        <w:rPr>
+          <w:rFonts w:ascii="Times New Roman" w:hAnsi="Times New Roman"/>
+          <w:b w:val="0"/>
+          <w:i w:val="0"/>
+          <w:color w:val="000000"/>
+          <w:sz w:val="16"/>
+        </w:rPr>
+        <w:t>Fameno (fitsipiteny)</w:t>
+      </w:r>
+    </w:p>
+    <w:p>
+      <w:pPr>
+        <w:spacing w:after="20"/>
+        <w:ind w:left="510"/>
+      </w:pPr>
+      <w:r>
+        <w:rPr>
+          <w:rFonts w:ascii="Times New Roman" w:hAnsi="Times New Roman"/>
+          <w:b w:val="0"/>
+          <w:i w:val="0"/>
+          <w:color w:val="000000"/>
+          <w:sz w:val="16"/>
+        </w:rPr>
+        <w:t>Wikipedia</w:t>
+      </w:r>
+    </w:p>
+    <w:p>
+      <w:pPr>
+        <w:spacing w:after="20"/>
+        <w:ind w:left="510"/>
+      </w:pPr>
+      <w:r>
+        <w:rPr>
+          <w:rFonts w:ascii="Times New Roman" w:hAnsi="Times New Roman"/>
+          <w:b w:val="0"/>
+          <w:i w:val="0"/>
+          <w:color w:val="000000"/>
+          <w:sz w:val="16"/>
+        </w:rPr>
+        <w:t>Wikimedia Foundation</w:t>
+      </w:r>
+    </w:p>
+    <w:p>
+      <w:pPr>
+        <w:spacing w:after="20"/>
+        <w:ind w:left="510"/>
+      </w:pPr>
+      <w:r>
+        <w:rPr>
+          <w:rFonts w:ascii="Times New Roman" w:hAnsi="Times New Roman"/>
+          <w:b w:val="0"/>
+          <w:i w:val="0"/>
+          <w:color w:val="000000"/>
+          <w:sz w:val="16"/>
+        </w:rPr>
+        <w:t>Powered by MediaWiki</w:t>
+      </w:r>
+    </w:p>
+    <w:p>
+      <w:pPr>
+        <w:spacing w:after="20"/>
+        <w:ind w:left="510"/>
+      </w:pPr>
+      <w:r>
+        <w:rPr>
+          <w:rFonts w:ascii="Times New Roman" w:hAnsi="Times New Roman"/>
+          <w:b w:val="0"/>
+          <w:i w:val="0"/>
+          <w:color w:val="000000"/>
+          <w:sz w:val="16"/>
+        </w:rPr>
+        <w:t>Nadika tamin'ny Parsoid ny pejy.</w:t>
+      </w:r>
+    </w:p>
+    <w:p>
+      <w:pPr>
+        <w:spacing w:after="20"/>
+        <w:ind w:left="510"/>
+      </w:pPr>
+      <w:r>
+        <w:rPr>
+          <w:rFonts w:ascii="Times New Roman" w:hAnsi="Times New Roman"/>
+          <w:b w:val="0"/>
+          <w:i w:val="0"/>
+          <w:color w:val="000000"/>
+          <w:sz w:val="16"/>
+        </w:rPr>
+        <w:t>Mitondra ny lisansa CC BY-SA 4.0 ny votoatiny raha tsy misy zava-kafa ambara.</w:t>
+      </w:r>
+    </w:p>
+    <w:p>
+      <w:pPr>
+        <w:spacing w:after="20"/>
+        <w:ind w:left="510"/>
+      </w:pPr>
+      <w:r>
+        <w:rPr>
+          <w:rFonts w:ascii="Times New Roman" w:hAnsi="Times New Roman"/>
+          <w:b w:val="0"/>
+          <w:i w:val="0"/>
+          <w:color w:val="000000"/>
+          <w:sz w:val="16"/>
+        </w:rPr>
+        <w:t>Fitsipika momba ny zavatra tsy sarababem-bahoaka Contacts juridiques &amp; sécurité Fitsipi-pitondran-tena Mpanitatra Statistika Filazana momba ny kokizy Fepe-pampiasana Birao</w:t>
+      </w:r>
+    </w:p>
+    <w:p>
+      <w:pPr>
+        <w:spacing w:after="120"/>
+        <w:ind w:left="170"/>
+      </w:pPr>
+      <w:r>
+        <w:rPr>
+          <w:rFonts w:ascii="Times New Roman" w:hAnsi="Times New Roman"/>
+          <w:b/>
+          <w:i w:val="0"/>
+          <w:color w:val="000000"/>
+          <w:sz w:val="20"/>
+        </w:rPr>
+        <w:t>2. JICA / PAGEM — « Vakiteny Modely (Famakiana tantara) », manuels de langue malgache, rapport d'appui à l'éducation</w:t>
+      </w:r>
+    </w:p>
+    <w:p>
+      <w:pPr>
+        <w:spacing w:after="120"/>
+        <w:ind w:left="340"/>
+      </w:pPr>
+      <w:r>
+        <w:rPr>
+          <w:rFonts w:ascii="Times New Roman" w:hAnsi="Times New Roman"/>
+          <w:b w:val="0"/>
+          <w:i w:val="0"/>
+          <w:color w:val="1F4E79"/>
+          <w:sz w:val="18"/>
+        </w:rPr>
+        <w:t>https://openjicareport.jica.go.jp/pdf/12356002.pdf</w:t>
+      </w:r>
+    </w:p>
+    <w:p>
+      <w:pPr>
+        <w:spacing w:after="60"/>
+        <w:ind w:left="510"/>
+      </w:pPr>
+      <w:r>
+        <w:rPr>
+          <w:rFonts w:ascii="Times New Roman" w:hAnsi="Times New Roman"/>
+          <w:b w:val="0"/>
+          <w:i/>
+          <w:color w:val="000000"/>
+          <w:sz w:val="20"/>
+        </w:rPr>
+        <w:t>Leçon modèle de vakiteny telle que conduite dans les manuels du programme (formules enseignantes en malgache, lecture guidée puis questions de vérification) : « Vakiteny Modely (Famakiana tantara) » — le document précise que cette leçon vise des élèves qui viennent d'apprendre à lire, d'où les phrases courtes, une idée par fehezanteny, et la vérification par questions dont la réponse se trouve dans le texte.</w:t>
+      </w:r>
+    </w:p>
+    <w:p>
       <w:r>
         <w:br w:type="page"/>
       </w:r>
@@ -15474,6 +16417,38 @@
           <w:sz w:val="20"/>
         </w:rPr>
         <w:t>https://ohabolana.org/ohabolana/vakio/o44868ce76e8e1</w:t>
+      </w:r>
+    </w:p>
+    <w:p>
+      <w:pPr>
+        <w:spacing w:after="120"/>
+        <w:ind w:left="227"/>
+      </w:pPr>
+      <w:r>
+        <w:rPr>
+          <w:rFonts w:ascii="Times New Roman" w:hAnsi="Times New Roman"/>
+          <w:b/>
+          <w:i w:val="0"/>
+          <w:color w:val="000000"/>
+          <w:sz w:val="22"/>
+        </w:rPr>
+        <w:t>5. Wikipedia (mg) — « Fehezanteny », Wikipedia malagasy, vasontolo malalaka</w:t>
+      </w:r>
+    </w:p>
+    <w:p>
+      <w:pPr>
+        <w:spacing w:after="120"/>
+        <w:ind w:left="510"/>
+      </w:pPr>
+      <w:r>
+        <w:rPr>
+          <w:rFonts w:ascii="Times New Roman" w:hAnsi="Times New Roman"/>
+          <w:b w:val="0"/>
+          <w:i w:val="0"/>
+          <w:color w:val="1F4E79"/>
+          <w:sz w:val="20"/>
+        </w:rPr>
+        <w:t>https://mg.wikipedia.org/wiki/Fehezanteny</w:t>
       </w:r>
     </w:p>
     <w:p>

</xml_diff>